<commit_message>
vault backup: 2026-06-15 22:44:32
</commit_message>
<xml_diff>
--- a/Clientes/Trivia/Projeto Trívia OS/Contrato Sinérgica - OS (Minuta).docx
+++ b/Clientes/Trivia/Projeto Trívia OS/Contrato Sinérgica - OS (Minuta).docx
@@ -831,7 +831,7 @@
           <w:b/>
           <w:bCs/>
         </w:rPr>
-        <w:t xml:space="preserve">CLÁUSULA 4ª – DO PRAZO E DO CRONOGRAMA</w:t>
+        <w:t xml:space="preserve">CLÁUSULA 4ª – DO PRAZO, DO CRONOGRAMA E DAS ENTREGAS</w:t>
       </w:r>
     </w:p>
     <w:p>
@@ -892,6 +892,62 @@
           <w:rFonts w:ascii="Arial" w:cs="Arial" w:eastAsia="Arial" w:hAnsi="Arial"/>
         </w:rPr>
         <w:t xml:space="preserve">Os prazos dependem do cumprimento tempestivo, pela CONTRATANTE, de suas obrigações (Cláusula 6ª), em especial o fornecimento de acessos, dados e aprovações. Atrasos imputáveis à CONTRATANTE prorrogam os prazos correspondentes, sem ônus à CONTRATADA.</w:t>
+      </w:r>
+    </w:p>
+    <w:p>
+      <w:pPr>
+        <w:spacing w:after="110" w:line="276"/>
+        <w:jc w:val="both"/>
+      </w:pPr>
+      <w:r>
+        <w:rPr>
+          <w:rFonts w:ascii="Arial" w:cs="Arial" w:eastAsia="Arial" w:hAnsi="Arial"/>
+          <w:b/>
+          <w:bCs/>
+        </w:rPr>
+        <w:t xml:space="preserve">4.4. </w:t>
+      </w:r>
+      <w:r>
+        <w:rPr>
+          <w:rFonts w:ascii="Arial" w:cs="Arial" w:eastAsia="Arial" w:hAnsi="Arial"/>
+          <w:b/>
+          <w:bCs/>
+        </w:rPr>
+        <w:t xml:space="preserve">Blueprint. </w:t>
+      </w:r>
+      <w:r>
+        <w:rPr>
+          <w:rFonts w:ascii="Arial" w:cs="Arial" w:eastAsia="Arial" w:hAnsi="Arial"/>
+        </w:rPr>
+        <w:t xml:space="preserve">Ao final da fase de Fundação/Diagnóstico (Mês 1, Anexo II), a CONTRATADA entregará à CONTRATANTE o Blueprint da Sinérgica OS, consolidando os Módulos, as integrações, os Agentes de IA, as automações e a arquitetura da solução. A aprovação formal do Blueprint pela CONTRATANTE constitui o marco de validação que autoriza o início da fase de construção.</w:t>
+      </w:r>
+    </w:p>
+    <w:p>
+      <w:pPr>
+        <w:spacing w:after="110" w:line="276"/>
+        <w:jc w:val="both"/>
+      </w:pPr>
+      <w:r>
+        <w:rPr>
+          <w:rFonts w:ascii="Arial" w:cs="Arial" w:eastAsia="Arial" w:hAnsi="Arial"/>
+          <w:b/>
+          <w:bCs/>
+        </w:rPr>
+        <w:t xml:space="preserve">4.5. </w:t>
+      </w:r>
+      <w:r>
+        <w:rPr>
+          <w:rFonts w:ascii="Arial" w:cs="Arial" w:eastAsia="Arial" w:hAnsi="Arial"/>
+          <w:b/>
+          <w:bCs/>
+        </w:rPr>
+        <w:t xml:space="preserve">Aceite e homologação por Módulo. </w:t>
+      </w:r>
+      <w:r>
+        <w:rPr>
+          <w:rFonts w:ascii="Arial" w:cs="Arial" w:eastAsia="Arial" w:hAnsi="Arial"/>
+        </w:rPr>
+        <w:t xml:space="preserve">Cada Módulo entregue será submetido à homologação da CONTRATANTE, que disporá de 5 (cinco) dias úteis para aprová-lo ou apontar correções por escrito. Não havendo manifestação no prazo, o Módulo será considerado aceito. As correções pertinentes ao escopo (Anexo I) serão realizadas sem custo; demandas fora do escopo seguem a Cláusula 3.3.</w:t>
       </w:r>
     </w:p>
     <w:p>
@@ -1119,7 +1175,7 @@
         <w:rPr>
           <w:rFonts w:ascii="Arial" w:cs="Arial" w:eastAsia="Arial" w:hAnsi="Arial"/>
         </w:rPr>
-        <w:t xml:space="preserve">fornecer, em tempo hábil, os acessos, credenciais, informações e dados necessários;</w:t>
+        <w:t xml:space="preserve">fornecer, em tempo hábil, os acessos, credenciais, informações e dados necessários, inclusive dos sistemas a serem integrados (Anexo IV);</w:t>
       </w:r>
     </w:p>
     <w:p>
@@ -1139,7 +1195,7 @@
         <w:rPr>
           <w:rFonts w:ascii="Arial" w:cs="Arial" w:eastAsia="Arial" w:hAnsi="Arial"/>
         </w:rPr>
-        <w:t xml:space="preserve">analisar e aprovar as entregas e marcos nos prazos do Anexo II, presumindo-se aprovadas as entregas não contestadas por escrito no prazo ali previsto;</w:t>
+        <w:t xml:space="preserve">analisar e aprovar as entregas e marcos nos prazos do Anexo II e da Cláusula 4.5;</w:t>
       </w:r>
     </w:p>
     <w:p>
@@ -1441,7 +1497,7 @@
         <w:rPr>
           <w:rFonts w:ascii="Arial" w:cs="Arial" w:eastAsia="Arial" w:hAnsi="Arial"/>
         </w:rPr>
-        <w:t xml:space="preserve">Quitado integralmente o preço (Cláusula 7ª), a CONTRATADA cede e transfere à CONTRATANTE, em caráter definitivo, irrevogável e sem limitação de tempo ou território, a totalidade dos direitos patrimoniais sobre o Sistema (Sinérgica OS) e sobre todo o software, código-fonte, documentação e materiais desenvolvidos sob este Contrato, nos termos das Leis nº 9.609/1998 e nº 9.610/1998, podendo a CONTRATANTE usá-los, modificá-los e mantê-los livremente, inclusive por terceiros de sua escolha.</w:t>
+        <w:t xml:space="preserve">Quitado integralmente o preço (Cláusula 7ª), a CONTRATADA cede e transfere à CONTRATANTE, em caráter definitivo, irrevogável e sem limitação de tempo ou território, a totalidade dos direitos patrimoniais sobre o Sistema (Sinérgica OS) e sobre todo o software, código-fonte, documentação e materiais desenvolvidos especificamente sob este Contrato, nos termos das Leis nº 9.609/1998 e nº 9.610/1998, podendo a CONTRATANTE usá-los, modificá-los e mantê-los livremente, inclusive por terceiros de sua escolha.</w:t>
       </w:r>
     </w:p>
     <w:p>
@@ -1497,7 +1553,7 @@
         <w:rPr>
           <w:rFonts w:ascii="Arial" w:cs="Arial" w:eastAsia="Arial" w:hAnsi="Arial"/>
         </w:rPr>
-        <w:t xml:space="preserve">Realizada a quitação, a CONTRATADA entregará à CONTRATANTE o código-fonte e a documentação técnica do Sistema, de modo que a CONTRATANTE não fique dependente da CONTRATADA.</w:t>
+        <w:t xml:space="preserve">Realizada a quitação, a CONTRATADA entregará à CONTRATANTE o código-fonte e a documentação técnica do Sistema, de modo que a CONTRATANTE não fique dependente da CONTRATADA, no prazo de 15 (quinze) dias úteis contados do recebimento da última parcela.</w:t>
       </w:r>
     </w:p>
     <w:p>
@@ -1554,6 +1610,34 @@
           <w:rFonts w:ascii="Arial" w:cs="Arial" w:eastAsia="Arial" w:hAnsi="Arial"/>
         </w:rPr>
         <w:t xml:space="preserve">A CONTRATANTE declara ser titular ou legítima utilizadora do nome empresarial “Sinérgica” e da denominação “Sinérgica OS” por ela escolhida, responsabilizando-se por sua adequação e isentando e indenizando a CONTRATADA por eventuais reclamações de terceiros relativas a tal denominação.</w:t>
+      </w:r>
+    </w:p>
+    <w:p>
+      <w:pPr>
+        <w:spacing w:after="110" w:line="276"/>
+        <w:jc w:val="both"/>
+      </w:pPr>
+      <w:r>
+        <w:rPr>
+          <w:rFonts w:ascii="Arial" w:cs="Arial" w:eastAsia="Arial" w:hAnsi="Arial"/>
+          <w:b/>
+          <w:bCs/>
+        </w:rPr>
+        <w:t xml:space="preserve">8.4. </w:t>
+      </w:r>
+      <w:r>
+        <w:rPr>
+          <w:rFonts w:ascii="Arial" w:cs="Arial" w:eastAsia="Arial" w:hAnsi="Arial"/>
+          <w:b/>
+          <w:bCs/>
+        </w:rPr>
+        <w:t xml:space="preserve">Propriedade prévia da CONTRATADA. </w:t>
+      </w:r>
+      <w:r>
+        <w:rPr>
+          <w:rFonts w:ascii="Arial" w:cs="Arial" w:eastAsia="Arial" w:hAnsi="Arial"/>
+        </w:rPr>
+        <w:t xml:space="preserve">A cessão da Cláusula 8.1 não alcança componentes, frameworks, bibliotecas, módulos genéricos, metodologias ou ferramentas de titularidade prévia da CONTRATADA, desenvolvidos independentemente deste Contrato (“Propriedade Prévia”), ainda que venham a ser incorporados ao Sistema. A Propriedade Prévia não abrange regras de negócio, fluxos operacionais, modelagens de processos, estruturas de dados, agentes ou funcionalidades desenvolvidos e disponibilizados especificamente para a CONTRATANTE neste projeto, os quais integram a cessão da Cláusula 8.1. Sobre a Propriedade Prévia eventualmente integrada ao Sistema, a CONTRATADA concede à CONTRATANTE, automaticamente com a quitação integral do preço, licença de uso irrevogável, não exclusiva e sem limitação de tempo ou território, para operação, manutenção e evolução do Sistema pela CONTRATANTE ou por terceiros de sua escolha, vedada a sublicença ou comercialização isolada da Propriedade Prévia.</w:t>
       </w:r>
     </w:p>
     <w:p>
@@ -1595,7 +1679,7 @@
         <w:rPr>
           <w:rFonts w:ascii="Arial" w:cs="Arial" w:eastAsia="Arial" w:hAnsi="Arial"/>
         </w:rPr>
-        <w:t xml:space="preserve">O objetivo do Sistema é unificar a operação, substituindo as ferramentas hoje utilizadas pela CONTRATANTE sempre que possível. Para os sistemas que a CONTRATANTE optar por manter, a integração ao Sistema dependerá da existência e da disponibilidade de API por parte desses terceiros.</w:t>
+        <w:t xml:space="preserve">O objetivo do Sistema é unificar a operação, substituindo as ferramentas hoje utilizadas pela CONTRATANTE sempre que possível. Para os sistemas que a CONTRATANTE optar por manter, a integração ao Sistema dependerá da existência e da disponibilidade de API por parte desses terceiros. As integrações previstas constam do Anexo IV.</w:t>
       </w:r>
     </w:p>
     <w:p>
@@ -1623,7 +1707,7 @@
         <w:rPr>
           <w:rFonts w:ascii="Arial" w:cs="Arial" w:eastAsia="Arial" w:hAnsi="Arial"/>
         </w:rPr>
-        <w:t xml:space="preserve">Os custos de infraestrutura e de Software de Terceiros necessários ao funcionamento do Sistema (nuvem/hospedagem, APIs de IA, APIs de Meta e Google, mensageria, entre outros) correrão por conta da CONTRATANTE e serão, sempre que possível, contratados em seu próprio nome.</w:t>
+        <w:t xml:space="preserve">Os custos de infraestrutura e de Software de Terceiros necessários ao funcionamento do Sistema (nuvem/hospedagem, APIs de IA, APIs de Meta e Google, mensageria, envio de e-mails, entre outros) correrão por conta da CONTRATANTE e serão, sempre que possível, contratados em seu próprio nome. Estima-se, preliminarmente, um custo mensal na faixa de R$ 800,00 a R$ 1.600,00, a ser apurado com precisão no diagnóstico, conforme o volume de uso.</w:t>
       </w:r>
     </w:p>
     <w:p>
@@ -1665,7 +1749,7 @@
           <w:b/>
           <w:bCs/>
         </w:rPr>
-        <w:t xml:space="preserve">CLÁUSULA 10ª – DO SUPORTE E DA MANUTENÇÃO (OPCIONAL)</w:t>
+        <w:t xml:space="preserve">CLÁUSULA 10ª – DA GARANTIA, DO SUPORTE E DA MANUTENÇÃO</w:t>
       </w:r>
     </w:p>
     <w:p>
@@ -1684,8 +1768,44 @@
       <w:r>
         <w:rPr>
           <w:rFonts w:ascii="Arial" w:cs="Arial" w:eastAsia="Arial" w:hAnsi="Arial"/>
-        </w:rPr>
-        <w:t xml:space="preserve">Após a entrega do Sistema, o suporte e a manutenção evolutiva não integram o objeto deste Contrato e poderão ser contratados à parte, mediante instrumento próprio, pelo valor de R$ 990,00 (novecentos e noventa reais) mensais ou conforme vier a ser acordado.</w:t>
+          <w:b/>
+          <w:bCs/>
+        </w:rPr>
+        <w:t xml:space="preserve">Garantia pós Go-live. </w:t>
+      </w:r>
+      <w:r>
+        <w:rPr>
+          <w:rFonts w:ascii="Arial" w:cs="Arial" w:eastAsia="Arial" w:hAnsi="Arial"/>
+        </w:rPr>
+        <w:t xml:space="preserve">A CONTRATADA garante o funcionamento do Sistema conforme entregue pelo prazo de 90 (noventa) dias corridos contados da data do Go-live (“Período de Garantia”). Durante esse período, a CONTRATADA corrigirá, sem custo adicional, defeitos ou falhas funcionais do Sistema imputáveis ao desenvolvimento realizado sob este Contrato. Não estão cobertos pela garantia: (i) erros decorrentes de uso inadequado pela CONTRATANTE ou por seus usuários; (ii) indisponibilidade ou alteração de Softwares de Terceiros; (iii) customizações realizadas pela CONTRATANTE ou por terceiros após o Go-live; e (iv) novos requisitos não contemplados no escopo original (Anexo I). Findo o Período de Garantia, qualquer manutenção corretiva ou evolutiva será objeto do instrumento de suporte previsto na Cláusula 10.2.</w:t>
+      </w:r>
+    </w:p>
+    <w:p>
+      <w:pPr>
+        <w:spacing w:after="110" w:line="276"/>
+        <w:jc w:val="both"/>
+      </w:pPr>
+      <w:r>
+        <w:rPr>
+          <w:rFonts w:ascii="Arial" w:cs="Arial" w:eastAsia="Arial" w:hAnsi="Arial"/>
+          <w:b/>
+          <w:bCs/>
+        </w:rPr>
+        <w:t xml:space="preserve">10.2. </w:t>
+      </w:r>
+      <w:r>
+        <w:rPr>
+          <w:rFonts w:ascii="Arial" w:cs="Arial" w:eastAsia="Arial" w:hAnsi="Arial"/>
+          <w:b/>
+          <w:bCs/>
+        </w:rPr>
+        <w:t xml:space="preserve">Suporte e manutenção evolutiva (opcional). </w:t>
+      </w:r>
+      <w:r>
+        <w:rPr>
+          <w:rFonts w:ascii="Arial" w:cs="Arial" w:eastAsia="Arial" w:hAnsi="Arial"/>
+        </w:rPr>
+        <w:t xml:space="preserve">Após o encerramento do Período de Garantia, o suporte e a manutenção evolutiva não integram o objeto deste Contrato e poderão ser contratados à parte, mediante instrumento próprio, pelo valor de R$ 990,00 (novecentos e noventa reais) mensais ou conforme vier a ser acordado.</w:t>
       </w:r>
     </w:p>
     <w:p>
@@ -1847,7 +1967,27 @@
         <w:rPr>
           <w:rFonts w:ascii="Arial" w:cs="Arial" w:eastAsia="Arial" w:hAnsi="Arial"/>
         </w:rPr>
-        <w:t xml:space="preserve">Ressalvado o dolo, a responsabilidade total da CONTRATADA decorrente deste Contrato limita-se ao valor efetivamente pago pela CONTRATANTE, não respondendo a CONTRATADA por lucros cessantes ou danos indiretos.</w:t>
+        <w:t xml:space="preserve">A responsabilidade total da CONTRATADA decorrente deste Contrato limita-se ao valor efetivamente pago pela CONTRATANTE, não respondendo a CONTRATADA por lucros cessantes ou danos indiretos. A limitação prevista nesta Cláusula não se aplica às hipóteses de dolo, fraude, violação do dever de confidencialidade, violação de direitos de propriedade intelectual e descumprimento, pela CONTRATADA, das obrigações de proteção de dados pessoais (LGPD), observada a Cláusula 13.2.</w:t>
+      </w:r>
+    </w:p>
+    <w:p>
+      <w:pPr>
+        <w:spacing w:after="110" w:line="276"/>
+        <w:jc w:val="both"/>
+      </w:pPr>
+      <w:r>
+        <w:rPr>
+          <w:rFonts w:ascii="Arial" w:cs="Arial" w:eastAsia="Arial" w:hAnsi="Arial"/>
+          <w:b/>
+          <w:bCs/>
+        </w:rPr>
+        <w:t xml:space="preserve">13.2. </w:t>
+      </w:r>
+      <w:r>
+        <w:rPr>
+          <w:rFonts w:ascii="Arial" w:cs="Arial" w:eastAsia="Arial" w:hAnsi="Arial"/>
+        </w:rPr>
+        <w:t xml:space="preserve">Quanto à proteção de dados pessoais (LGPD), a responsabilidade ilimitada prevista na Cláusula 13.1 abrange apenas os incidentes decorrentes de conduta intencional ou da própria operação da CONTRATADA (ação ou omissão a ela imputável). A CONTRATADA não responde por incidentes originados de Softwares de Terceiros ou de serviços de terceiros (por exemplo, provedores de nuvem, APIs e mensageria), conforme a Cláusula 9.3; tais hipóteses sujeitam-se ao limite geral da Cláusula 13.1.</w:t>
       </w:r>
     </w:p>
     <w:p>
@@ -1881,7 +2021,7 @@
         <w:rPr>
           <w:rFonts w:ascii="Arial" w:cs="Arial" w:eastAsia="Arial" w:hAnsi="Arial"/>
         </w:rPr>
-        <w:t xml:space="preserve">Este Contrato vigora da assinatura até a entrega e o aceite do Sistema (Go-live), subsistindo as obrigações que, por sua natureza, perdurem (cessão de direitos, confidencialidade, proteção de dados e case).</w:t>
+        <w:t xml:space="preserve">Este Contrato vigora da assinatura até o encerramento do Período de Garantia previsto na Cláusula 10.1, subsistindo as obrigações que, por sua natureza, perdurem (cessão de direitos, confidencialidade, proteção de dados e case).</w:t>
       </w:r>
     </w:p>
     <w:p>
@@ -2177,7 +2317,7 @@
         <w:rPr>
           <w:rFonts w:ascii="Arial" w:cs="Arial" w:eastAsia="Arial" w:hAnsi="Arial"/>
         </w:rPr>
-        <w:t xml:space="preserve">Integram este Contrato: Anexo I (Escopo Detalhado dos Módulos); Anexo II (Roadmap de Implementação); Anexo III (Tratamento de Dados Pessoais – LGPD).</w:t>
+        <w:t xml:space="preserve">Integram este Contrato: Anexo I (Escopo Detalhado dos Módulos); Anexo II (Roadmap de Implementação); Anexo III (Tratamento de Dados Pessoais – LGPD); e Anexo IV (Integrações Previstas).</w:t>
       </w:r>
     </w:p>
     <w:p>
@@ -2235,23 +2375,7 @@
         <w:rPr>
           <w:rFonts w:ascii="Arial" w:cs="Arial" w:eastAsia="Arial" w:hAnsi="Arial"/>
         </w:rPr>
-        <w:t xml:space="preserve">Campinas/SP, </w:t>
-      </w:r>
-      <w:r>
-        <w:rPr>
-          <w:rFonts w:ascii="Arial" w:cs="Arial" w:eastAsia="Arial" w:hAnsi="Arial"/>
-          <w:b/>
-          <w:bCs/>
-          <w:highlight w:val="yellow"/>
-          <w:highlightCs w:val="yellow"/>
-        </w:rPr>
-        <w:t xml:space="preserve">[DATA]</w:t>
-      </w:r>
-      <w:r>
-        <w:rPr>
-          <w:rFonts w:ascii="Arial" w:cs="Arial" w:eastAsia="Arial" w:hAnsi="Arial"/>
-        </w:rPr>
-        <w:t xml:space="preserve">.</w:t>
+        <w:t xml:space="preserve">Campinas/SP, 15 de junho de 2026.</w:t>
       </w:r>
     </w:p>
     <w:p>
@@ -2304,7 +2428,7 @@
         <w:rPr>
           <w:rFonts w:ascii="Arial" w:cs="Arial" w:eastAsia="Arial" w:hAnsi="Arial"/>
         </w:rPr>
-        <w:t xml:space="preserve">Representante: João Gabriel Novais Rocha dos Santos</w:t>
+        <w:t xml:space="preserve">João Gabriel Novais Rocha dos Santos · CPF 363.639.278-62</w:t>
       </w:r>
     </w:p>
     <w:p>
@@ -2357,7 +2481,7 @@
         <w:rPr>
           <w:rFonts w:ascii="Arial" w:cs="Arial" w:eastAsia="Arial" w:hAnsi="Arial"/>
         </w:rPr>
-        <w:t xml:space="preserve">Representante: Fabrício Barbosa Nunes Medeiros</w:t>
+        <w:t xml:space="preserve">Fabrício Barbosa Nunes Medeiros · CPF 057.769.621-10</w:t>
       </w:r>
     </w:p>
     <w:p>
@@ -2391,71 +2515,19 @@
         <w:rPr>
           <w:rFonts w:ascii="Arial" w:cs="Arial" w:eastAsia="Arial" w:hAnsi="Arial"/>
         </w:rPr>
-        <w:t xml:space="preserve">1. Nome: </w:t>
-      </w:r>
-      <w:r>
-        <w:rPr>
-          <w:rFonts w:ascii="Arial" w:cs="Arial" w:eastAsia="Arial" w:hAnsi="Arial"/>
-          <w:b/>
-          <w:bCs/>
-          <w:highlight w:val="yellow"/>
-          <w:highlightCs w:val="yellow"/>
-        </w:rPr>
-        <w:t xml:space="preserve">[ ]</w:t>
-      </w:r>
-      <w:r>
-        <w:rPr>
-          <w:rFonts w:ascii="Arial" w:cs="Arial" w:eastAsia="Arial" w:hAnsi="Arial"/>
-        </w:rPr>
-        <w:t xml:space="preserve">  CPF: </w:t>
-      </w:r>
-      <w:r>
-        <w:rPr>
-          <w:rFonts w:ascii="Arial" w:cs="Arial" w:eastAsia="Arial" w:hAnsi="Arial"/>
-          <w:b/>
-          <w:bCs/>
-          <w:highlight w:val="yellow"/>
-          <w:highlightCs w:val="yellow"/>
-        </w:rPr>
-        <w:t xml:space="preserve">[ ]</w:t>
-      </w:r>
-    </w:p>
-    <w:p>
-      <w:pPr>
-        <w:spacing w:after="120" w:line="276"/>
-        <w:jc w:val="both"/>
-      </w:pPr>
-      <w:r>
-        <w:rPr>
-          <w:rFonts w:ascii="Arial" w:cs="Arial" w:eastAsia="Arial" w:hAnsi="Arial"/>
-        </w:rPr>
-        <w:t xml:space="preserve">2. Nome: </w:t>
-      </w:r>
-      <w:r>
-        <w:rPr>
-          <w:rFonts w:ascii="Arial" w:cs="Arial" w:eastAsia="Arial" w:hAnsi="Arial"/>
-          <w:b/>
-          <w:bCs/>
-          <w:highlight w:val="yellow"/>
-          <w:highlightCs w:val="yellow"/>
-        </w:rPr>
-        <w:t xml:space="preserve">[ ]</w:t>
-      </w:r>
-      <w:r>
-        <w:rPr>
-          <w:rFonts w:ascii="Arial" w:cs="Arial" w:eastAsia="Arial" w:hAnsi="Arial"/>
-        </w:rPr>
-        <w:t xml:space="preserve">  CPF: </w:t>
-      </w:r>
-      <w:r>
-        <w:rPr>
-          <w:rFonts w:ascii="Arial" w:cs="Arial" w:eastAsia="Arial" w:hAnsi="Arial"/>
-          <w:b/>
-          <w:bCs/>
-          <w:highlight w:val="yellow"/>
-          <w:highlightCs w:val="yellow"/>
-        </w:rPr>
-        <w:t xml:space="preserve">[ ]</w:t>
+        <w:t xml:space="preserve">1. Aline Azevedo Nazário · CPF 112.777.477-84 · administrativo@sinergicamanutencoes.com.br</w:t>
+      </w:r>
+    </w:p>
+    <w:p>
+      <w:pPr>
+        <w:spacing w:after="120" w:line="276"/>
+        <w:jc w:val="both"/>
+      </w:pPr>
+      <w:r>
+        <w:rPr>
+          <w:rFonts w:ascii="Arial" w:cs="Arial" w:eastAsia="Arial" w:hAnsi="Arial"/>
+        </w:rPr>
+        <w:t xml:space="preserve">2. Lucas Moreira Azevedo · CPF 432.312.288-83 · lucas@triviastudio.com.br</w:t>
       </w:r>
     </w:p>
     <w:p>
@@ -2482,7 +2554,7 @@
         <w:rPr>
           <w:rFonts w:ascii="Arial" w:cs="Arial" w:eastAsia="Arial" w:hAnsi="Arial"/>
         </w:rPr>
-        <w:t xml:space="preserve">O Sistema (Sinérgica OS) unifica a operação da CONTRATANTE nos módulos abaixo. O detalhamento poderá ser refinado na fase de diagnóstico, mantida a coerência com este escopo.</w:t>
+        <w:t xml:space="preserve">O Sistema (Sinérgica OS) unifica a operação da CONTRATANTE nos módulos abaixo. O detalhamento poderá ser refinado na fase de diagnóstico e consolidado no blueprint (Cláusula 4.4), mantida a coerência com este escopo.</w:t>
       </w:r>
     </w:p>
     <w:p>
@@ -2582,7 +2654,7 @@
         <w:rPr>
           <w:rFonts w:ascii="Arial" w:cs="Arial" w:eastAsia="Arial" w:hAnsi="Arial"/>
         </w:rPr>
-        <w:t xml:space="preserve">Abertura e gestão de ordens de serviço, agenda dos técnicos, histórico por cliente e controle de estoque de peças, com um agente de IA apoiando os técnicos na operação.</w:t>
+        <w:t xml:space="preserve">Ordens de serviço, agenda dos técnicos, histórico por cliente e controle de estoque de peças, com um agente de IA apoiando os técnicos. O Auvo é mantido como sistema de campo e integrado ao Sistema via API (Anexo IV), salvo decisão posterior da CONTRATANTE de substituí-lo. O PCM (Planejamento e Controle de Manutenção) existente será aproveitado, incluindo suas regras de negócio e a integração com o Auvo, realizando-se os ajustes, evoluções e integrações necessários para operar na arquitetura do Sinérgica OS e na base única.</w:t>
       </w:r>
     </w:p>
     <w:p>
@@ -2663,6 +2735,26 @@
           <w:rFonts w:ascii="Arial" w:cs="Arial" w:eastAsia="Arial" w:hAnsi="Arial"/>
         </w:rPr>
         <w:t xml:space="preserve">Portal de acesso para os clientes finais da CONTRATANTE acompanharem suas ordens de serviço, status de atendimentos, histórico, documentos e situação financeira.</w:t>
+      </w:r>
+    </w:p>
+    <w:p>
+      <w:pPr>
+        <w:spacing w:after="120" w:line="276"/>
+        <w:jc w:val="both"/>
+      </w:pPr>
+      <w:r>
+        <w:rPr>
+          <w:rFonts w:ascii="Arial" w:cs="Arial" w:eastAsia="Arial" w:hAnsi="Arial"/>
+          <w:b/>
+          <w:bCs/>
+        </w:rPr>
+        <w:t xml:space="preserve">Agentes de IA no Go-live: </w:t>
+      </w:r>
+      <w:r>
+        <w:rPr>
+          <w:rFonts w:ascii="Arial" w:cs="Arial" w:eastAsia="Arial" w:hAnsi="Arial"/>
+        </w:rPr>
+        <w:t xml:space="preserve">será entregue ao menos 1 (um) agente de IA por área/Módulo, com evolução e especialização ao longo do uso.</w:t>
       </w:r>
     </w:p>
     <w:p>
@@ -2769,7 +2861,7 @@
         <w:rPr>
           <w:rFonts w:ascii="Arial" w:cs="Arial" w:eastAsia="Arial" w:hAnsi="Arial"/>
         </w:rPr>
-        <w:t xml:space="preserve">Diagnóstico da operação, fundação da base de dados única e definição fina do escopo dos Módulos.</w:t>
+        <w:t xml:space="preserve">Diagnóstico da operação, fundação da base de dados única e definição fina do escopo dos Módulos, encerrando com a entrega do Blueprint da Sinérgica OS, cuja aprovação formal é o marco que autoriza o início da fase de construção (Cláusula 4.4).</w:t>
       </w:r>
     </w:p>
     <w:p>
@@ -2789,7 +2881,7 @@
         <w:rPr>
           <w:rFonts w:ascii="Arial" w:cs="Arial" w:eastAsia="Arial" w:hAnsi="Arial"/>
         </w:rPr>
-        <w:t xml:space="preserve">Desenvolvimento e configuração dos Módulos centrais (Comercial/CRM, Operação Técnica e Estoque e Financeiro) e implantação do primeiro Agente de IA.</w:t>
+        <w:t xml:space="preserve">Desenvolvimento e configuração dos Módulos centrais (Comercial/CRM, Operação Técnica e Estoque e Financeiro), integração do Auvo via API e implantação dos primeiros Agentes de IA.</w:t>
       </w:r>
     </w:p>
     <w:p>
@@ -2809,7 +2901,7 @@
         <w:rPr>
           <w:rFonts w:ascii="Arial" w:cs="Arial" w:eastAsia="Arial" w:hAnsi="Arial"/>
         </w:rPr>
-        <w:t xml:space="preserve">Módulos de Atendimento com IA, Marketing/Conteúdo, Growth/Ads e Área do Cliente; integrações, testes, capacitação da equipe e Go-live.</w:t>
+        <w:t xml:space="preserve">Módulos de Atendimento com IA, Marketing/Conteúdo, Growth/Ads e Área do Cliente; demais integrações; testes; capacitação da equipe; e Go-live, com ao menos 1 (um) agente de IA por área.</w:t>
       </w:r>
     </w:p>
     <w:p>
@@ -2956,7 +3048,7 @@
         <w:rPr>
           <w:rFonts w:ascii="Arial" w:cs="Arial" w:eastAsia="Arial" w:hAnsi="Arial"/>
         </w:rPr>
-        <w:t xml:space="preserve">provedores de nuvem/hospedagem e os serviços de terceiros utilizados (por exemplo, serviços de IA e de mensageria), contratados conforme a Cláusula 9ª.</w:t>
+        <w:t xml:space="preserve">provedores de nuvem/hospedagem e os serviços de terceiros utilizados (por exemplo, serviços de IA, de mensageria e de envio de e-mails), contratados conforme a Cláusula 9ª.</w:t>
       </w:r>
     </w:p>
     <w:p>
@@ -2997,6 +3089,133 @@
           <w:rFonts w:ascii="Arial" w:cs="Arial" w:eastAsia="Arial" w:hAnsi="Arial"/>
         </w:rPr>
         <w:t xml:space="preserve">ao término do Contrato, os dados pessoais serão eliminados ou devolvidos, salvo retenção exigida por lei.</w:t>
+      </w:r>
+    </w:p>
+    <w:p>
+      <w:pPr>
+        <w:pStyle w:val="Heading1"/>
+        <w:pageBreakBefore/>
+        <w:spacing w:after="160"/>
+      </w:pPr>
+      <w:r>
+        <w:rPr>
+          <w:rFonts w:ascii="Arial" w:cs="Arial" w:eastAsia="Arial" w:hAnsi="Arial"/>
+          <w:b/>
+          <w:bCs/>
+        </w:rPr>
+        <w:t xml:space="preserve">ANEXO IV – INTEGRAÇÕES PREVISTAS</w:t>
+      </w:r>
+    </w:p>
+    <w:p>
+      <w:pPr>
+        <w:spacing w:after="120" w:line="276"/>
+        <w:jc w:val="both"/>
+      </w:pPr>
+      <w:r>
+        <w:rPr>
+          <w:rFonts w:ascii="Arial" w:cs="Arial" w:eastAsia="Arial" w:hAnsi="Arial"/>
+        </w:rPr>
+        <w:t xml:space="preserve">As integrações abaixo dependem da existência e da disponibilidade de API por parte dos respectivos sistemas (Cláusula 9.1). Outras integrações poderão ser incluídas conforme o diagnóstico.</w:t>
+      </w:r>
+    </w:p>
+    <w:p>
+      <w:pPr>
+        <w:spacing w:after="120" w:line="276"/>
+        <w:jc w:val="both"/>
+      </w:pPr>
+      <w:r>
+        <w:rPr>
+          <w:rFonts w:ascii="Arial" w:cs="Arial" w:eastAsia="Arial" w:hAnsi="Arial"/>
+          <w:b/>
+          <w:bCs/>
+        </w:rPr>
+        <w:t xml:space="preserve">• WhatsApp</w:t>
+      </w:r>
+      <w:r>
+        <w:rPr>
+          <w:rFonts w:ascii="Arial" w:cs="Arial" w:eastAsia="Arial" w:hAnsi="Arial"/>
+        </w:rPr>
+        <w:t xml:space="preserve"> — atendimento e Agentes de IA.</w:t>
+      </w:r>
+    </w:p>
+    <w:p>
+      <w:pPr>
+        <w:spacing w:after="120" w:line="276"/>
+        <w:jc w:val="both"/>
+      </w:pPr>
+      <w:r>
+        <w:rPr>
+          <w:rFonts w:ascii="Arial" w:cs="Arial" w:eastAsia="Arial" w:hAnsi="Arial"/>
+          <w:b/>
+          <w:bCs/>
+        </w:rPr>
+        <w:t xml:space="preserve">• Meta Ads e Google Ads</w:t>
+      </w:r>
+      <w:r>
+        <w:rPr>
+          <w:rFonts w:ascii="Arial" w:cs="Arial" w:eastAsia="Arial" w:hAnsi="Arial"/>
+        </w:rPr>
+        <w:t xml:space="preserve"> — análise de campanhas (Módulo Growth).</w:t>
+      </w:r>
+    </w:p>
+    <w:p>
+      <w:pPr>
+        <w:spacing w:after="120" w:line="276"/>
+        <w:jc w:val="both"/>
+      </w:pPr>
+      <w:r>
+        <w:rPr>
+          <w:rFonts w:ascii="Arial" w:cs="Arial" w:eastAsia="Arial" w:hAnsi="Arial"/>
+          <w:b/>
+          <w:bCs/>
+        </w:rPr>
+        <w:t xml:space="preserve">• Auvo</w:t>
+      </w:r>
+      <w:r>
+        <w:rPr>
+          <w:rFonts w:ascii="Arial" w:cs="Arial" w:eastAsia="Arial" w:hAnsi="Arial"/>
+        </w:rPr>
+        <w:t xml:space="preserve"> — sistema de campo, mantido e integrado via API (Módulo de Operação Técnica e Estoque).</w:t>
+      </w:r>
+    </w:p>
+    <w:p>
+      <w:pPr>
+        <w:spacing w:after="120" w:line="276"/>
+        <w:jc w:val="both"/>
+      </w:pPr>
+      <w:r>
+        <w:rPr>
+          <w:rFonts w:ascii="Arial" w:cs="Arial" w:eastAsia="Arial" w:hAnsi="Arial"/>
+          <w:b/>
+          <w:bCs/>
+        </w:rPr>
+        <w:t xml:space="preserve">• Sistema fiscal / NF-e</w:t>
+      </w:r>
+      <w:r>
+        <w:rPr>
+          <w:rFonts w:ascii="Arial" w:cs="Arial" w:eastAsia="Arial" w:hAnsi="Arial"/>
+        </w:rPr>
+        <w:t xml:space="preserve"> — emissão e conciliação fiscal (Módulo Financeiro).</w:t>
+      </w:r>
+    </w:p>
+    <w:p>
+      <w:pPr>
+        <w:spacing w:after="120" w:line="276"/>
+        <w:jc w:val="both"/>
+      </w:pPr>
+      <w:r>
+        <w:rPr>
+          <w:rFonts w:ascii="Arial" w:cs="Arial" w:eastAsia="Arial" w:hAnsi="Arial"/>
+          <w:b/>
+          <w:bCs/>
+        </w:rPr>
+        <w:t xml:space="preserve">• Resend</w:t>
+      </w:r>
+      <w:r>
+        <w:rPr>
+          <w:rFonts w:ascii="Arial" w:cs="Arial" w:eastAsia="Arial" w:hAnsi="Arial"/>
+        </w:rPr>
+        <w:t xml:space="preserve"> — envio de e-mails transacionais e de comunicação.</w:t>
       </w:r>
     </w:p>
     <w:sectPr>

</xml_diff>